<commit_message>
Added Google fonts and GitHub link to documentation
</commit_message>
<xml_diff>
--- a/CIA1/2647137_Documentation.docx
+++ b/CIA1/2647137_Documentation.docx
@@ -422,7 +422,7 @@
         <w:rPr>
           <w:rFonts w:ascii="Times New Roman" w:hAnsi="Times New Roman" w:cs="Times New Roman"/>
         </w:rPr>
-        <w:t>The navigation bar stays fixed at the top and lets users scroll smoothly through different sections.</w:t>
+        <w:t>Added Google fonts.</w:t>
       </w:r>
     </w:p>
     <w:p>
@@ -441,7 +441,7 @@
         <w:rPr>
           <w:rFonts w:ascii="Times New Roman" w:hAnsi="Times New Roman" w:cs="Times New Roman"/>
         </w:rPr>
-        <w:t>The header section welcomes visitors to the platform.</w:t>
+        <w:t>The navigation bar stays fixed at the top and lets users scroll smoothly through different sections.</w:t>
       </w:r>
     </w:p>
     <w:p>
@@ -460,19 +460,7 @@
         <w:rPr>
           <w:rFonts w:ascii="Times New Roman" w:hAnsi="Times New Roman" w:cs="Times New Roman"/>
         </w:rPr>
-        <w:t>The services section highlights the types of events offered: Wedding, Corporate, Birthday</w:t>
-      </w:r>
-      <w:r>
-        <w:rPr>
-          <w:rFonts w:ascii="Times New Roman" w:hAnsi="Times New Roman" w:cs="Times New Roman"/>
-        </w:rPr>
-        <w:t xml:space="preserve"> and </w:t>
-      </w:r>
-      <w:r>
-        <w:rPr>
-          <w:rFonts w:ascii="Times New Roman" w:hAnsi="Times New Roman" w:cs="Times New Roman"/>
-        </w:rPr>
-        <w:t>Concert.</w:t>
+        <w:t>The header section welcomes visitors to the platform.</w:t>
       </w:r>
     </w:p>
     <w:p>
@@ -492,6 +480,25 @@
           <w:rFonts w:ascii="Times New Roman" w:hAnsi="Times New Roman" w:cs="Times New Roman"/>
         </w:rPr>
         <w:lastRenderedPageBreak/>
+        <w:t>The services section highlights the types of events offered: Wedding, Corporate, Birthday and Concert.</w:t>
+      </w:r>
+    </w:p>
+    <w:p>
+      <w:pPr>
+        <w:pStyle w:val="ListParagraph"/>
+        <w:numPr>
+          <w:ilvl w:val="0"/>
+          <w:numId w:val="2"/>
+        </w:numPr>
+        <w:jc w:val="both"/>
+        <w:rPr>
+          <w:rFonts w:ascii="Times New Roman" w:hAnsi="Times New Roman" w:cs="Times New Roman"/>
+        </w:rPr>
+      </w:pPr>
+      <w:r>
+        <w:rPr>
+          <w:rFonts w:ascii="Times New Roman" w:hAnsi="Times New Roman" w:cs="Times New Roman"/>
+        </w:rPr>
         <w:t>The booking form collects basic information</w:t>
       </w:r>
       <w:r>
@@ -719,25 +726,7 @@
         <w:rPr>
           <w:rFonts w:ascii="Times New Roman" w:hAnsi="Times New Roman" w:cs="Times New Roman"/>
         </w:rPr>
-        <w:t>I</w:t>
-      </w:r>
-      <w:r>
-        <w:rPr>
-          <w:rFonts w:ascii="Times New Roman" w:hAnsi="Times New Roman" w:cs="Times New Roman"/>
-        </w:rPr>
-        <w:t>t’s just a prototype</w:t>
-      </w:r>
-      <w:r>
-        <w:rPr>
-          <w:rFonts w:ascii="Times New Roman" w:hAnsi="Times New Roman" w:cs="Times New Roman"/>
-        </w:rPr>
-        <w:t xml:space="preserve"> So,</w:t>
-      </w:r>
-      <w:r>
-        <w:rPr>
-          <w:rFonts w:ascii="Times New Roman" w:hAnsi="Times New Roman" w:cs="Times New Roman"/>
-        </w:rPr>
-        <w:t xml:space="preserve"> no backend or database.</w:t>
+        <w:t>It’s just a prototype So, no backend or database.</w:t>
       </w:r>
     </w:p>
     <w:p>
@@ -777,19 +766,7 @@
         <w:rPr>
           <w:rFonts w:ascii="Times New Roman" w:hAnsi="Times New Roman" w:cs="Times New Roman"/>
         </w:rPr>
-        <w:t>Form validation only covers required fields</w:t>
-      </w:r>
-      <w:r>
-        <w:rPr>
-          <w:rFonts w:ascii="Times New Roman" w:hAnsi="Times New Roman" w:cs="Times New Roman"/>
-        </w:rPr>
-        <w:t xml:space="preserve"> </w:t>
-      </w:r>
-      <w:r>
-        <w:rPr>
-          <w:rFonts w:ascii="Times New Roman" w:hAnsi="Times New Roman" w:cs="Times New Roman"/>
-        </w:rPr>
-        <w:t>nothing advanced.</w:t>
+        <w:t>Form validation only covers required fields nothing advanced.</w:t>
       </w:r>
     </w:p>
     <w:p>
@@ -948,31 +925,7 @@
         <w:rPr>
           <w:rFonts w:ascii="Times New Roman" w:hAnsi="Times New Roman" w:cs="Times New Roman"/>
         </w:rPr>
-        <w:t xml:space="preserve">Used Microsoft Copilot to help </w:t>
-      </w:r>
-      <w:r>
-        <w:rPr>
-          <w:rFonts w:ascii="Times New Roman" w:hAnsi="Times New Roman" w:cs="Times New Roman"/>
-        </w:rPr>
-        <w:t xml:space="preserve">decide the theme of website </w:t>
-      </w:r>
-      <w:r>
-        <w:rPr>
-          <w:rFonts w:ascii="Times New Roman" w:hAnsi="Times New Roman" w:cs="Times New Roman"/>
-        </w:rPr>
-        <w:t xml:space="preserve">and </w:t>
-      </w:r>
-      <w:r>
-        <w:rPr>
-          <w:rFonts w:ascii="Times New Roman" w:hAnsi="Times New Roman" w:cs="Times New Roman"/>
-        </w:rPr>
-        <w:t>documentation generation</w:t>
-      </w:r>
-      <w:r>
-        <w:rPr>
-          <w:rFonts w:ascii="Times New Roman" w:hAnsi="Times New Roman" w:cs="Times New Roman"/>
-        </w:rPr>
-        <w:t>.</w:t>
+        <w:t>Used Microsoft Copilot to help decide the theme of website and documentation generation.</w:t>
       </w:r>
     </w:p>
     <w:p>
@@ -991,19 +944,7 @@
         <w:rPr>
           <w:rFonts w:ascii="Times New Roman" w:hAnsi="Times New Roman" w:cs="Times New Roman"/>
         </w:rPr>
-        <w:t xml:space="preserve">The </w:t>
-      </w:r>
-      <w:r>
-        <w:rPr>
-          <w:rFonts w:ascii="Times New Roman" w:hAnsi="Times New Roman" w:cs="Times New Roman"/>
-        </w:rPr>
-        <w:t>purpose: create beautiful design website and speedup documentation process</w:t>
-      </w:r>
-      <w:r>
-        <w:rPr>
-          <w:rFonts w:ascii="Times New Roman" w:hAnsi="Times New Roman" w:cs="Times New Roman"/>
-        </w:rPr>
-        <w:t>.</w:t>
+        <w:t>The purpose: create beautiful design website and speedup documentation process.</w:t>
       </w:r>
     </w:p>
     <w:p>
@@ -1126,6 +1067,74 @@
     </w:p>
     <w:p>
       <w:pPr>
+        <w:ind w:left="360"/>
+        <w:jc w:val="both"/>
+        <w:rPr>
+          <w:rFonts w:ascii="Times New Roman" w:hAnsi="Times New Roman" w:cs="Times New Roman"/>
+          <w:b/>
+          <w:bCs/>
+          <w:sz w:val="28"/>
+          <w:szCs w:val="28"/>
+          <w:u w:val="single"/>
+        </w:rPr>
+      </w:pPr>
+      <w:r>
+        <w:rPr>
+          <w:rFonts w:ascii="Times New Roman" w:hAnsi="Times New Roman" w:cs="Times New Roman"/>
+          <w:b/>
+          <w:bCs/>
+          <w:sz w:val="28"/>
+          <w:szCs w:val="28"/>
+          <w:u w:val="single"/>
+        </w:rPr>
+        <w:lastRenderedPageBreak/>
+        <w:t>GitHub Link</w:t>
+      </w:r>
+    </w:p>
+    <w:p>
+      <w:pPr>
+        <w:ind w:left="360"/>
+        <w:jc w:val="both"/>
+        <w:rPr>
+          <w:rFonts w:ascii="Times New Roman" w:hAnsi="Times New Roman" w:cs="Times New Roman"/>
+        </w:rPr>
+      </w:pPr>
+      <w:hyperlink r:id="rId5" w:history="1">
+        <w:r>
+          <w:rPr>
+            <w:rStyle w:val="Hyperlink"/>
+            <w:rFonts w:ascii="Times New Roman" w:hAnsi="Times New Roman" w:cs="Times New Roman"/>
+          </w:rPr>
+          <w:t>https://github.com/manan-hemani/FSD-Lab/tree/m</w:t>
+        </w:r>
+        <w:r>
+          <w:rPr>
+            <w:rStyle w:val="Hyperlink"/>
+            <w:rFonts w:ascii="Times New Roman" w:hAnsi="Times New Roman" w:cs="Times New Roman"/>
+          </w:rPr>
+          <w:t>a</w:t>
+        </w:r>
+        <w:r>
+          <w:rPr>
+            <w:rStyle w:val="Hyperlink"/>
+            <w:rFonts w:ascii="Times New Roman" w:hAnsi="Times New Roman" w:cs="Times New Roman"/>
+          </w:rPr>
+          <w:t>in/CIA1</w:t>
+        </w:r>
+      </w:hyperlink>
+    </w:p>
+    <w:p>
+      <w:pPr>
+        <w:ind w:left="360"/>
+        <w:jc w:val="both"/>
+        <w:rPr>
+          <w:rFonts w:ascii="Times New Roman" w:hAnsi="Times New Roman" w:cs="Times New Roman"/>
+        </w:rPr>
+      </w:pPr>
+    </w:p>
+    <w:p>
+      <w:pPr>
+        <w:ind w:left="360"/>
         <w:jc w:val="both"/>
         <w:rPr>
           <w:rFonts w:ascii="Times New Roman" w:hAnsi="Times New Roman" w:cs="Times New Roman"/>
@@ -2876,6 +2885,41 @@
       <w:spacing w:val="5"/>
     </w:rPr>
   </w:style>
+  <w:style w:type="character" w:styleId="Hyperlink">
+    <w:name w:val="Hyperlink"/>
+    <w:basedOn w:val="DefaultParagraphFont"/>
+    <w:uiPriority w:val="99"/>
+    <w:unhideWhenUsed/>
+    <w:rsid w:val="00A47899"/>
+    <w:rPr>
+      <w:color w:val="0563C1" w:themeColor="hyperlink"/>
+      <w:u w:val="single"/>
+    </w:rPr>
+  </w:style>
+  <w:style w:type="character" w:styleId="UnresolvedMention">
+    <w:name w:val="Unresolved Mention"/>
+    <w:basedOn w:val="DefaultParagraphFont"/>
+    <w:uiPriority w:val="99"/>
+    <w:semiHidden/>
+    <w:unhideWhenUsed/>
+    <w:rsid w:val="00A47899"/>
+    <w:rPr>
+      <w:color w:val="605E5C"/>
+      <w:shd w:val="clear" w:color="auto" w:fill="E1DFDD"/>
+    </w:rPr>
+  </w:style>
+  <w:style w:type="character" w:styleId="FollowedHyperlink">
+    <w:name w:val="FollowedHyperlink"/>
+    <w:basedOn w:val="DefaultParagraphFont"/>
+    <w:uiPriority w:val="99"/>
+    <w:semiHidden/>
+    <w:unhideWhenUsed/>
+    <w:rsid w:val="00A47899"/>
+    <w:rPr>
+      <w:color w:val="954F72" w:themeColor="followedHyperlink"/>
+      <w:u w:val="single"/>
+    </w:rPr>
+  </w:style>
 </w:styles>
 </file>
 

</xml_diff>